<commit_message>
added the pdf to the project
</commit_message>
<xml_diff>
--- a/SEG3125-lab8and9-Group05/SEG 3125 Lab 9.docx
+++ b/SEG3125-lab8and9-Group05/SEG 3125 Lab 9.docx
@@ -81,23 +81,20 @@
           <w:b/>
           <w:bCs/>
         </w:rPr>
-        <w:t xml:space="preserve">Link to the GitHub Classroom repository: </w:t>
+        <w:t>Link to the GitHub Classroom repository:</w:t>
+      </w:r>
+      <w:r>
+        <w:t xml:space="preserve"> </w:t>
       </w:r>
       <w:hyperlink r:id="rId5" w:history="1">
         <w:r>
           <w:rPr>
             <w:rStyle w:val="Hyperlink"/>
-            <w:b/>
-            <w:bCs/>
           </w:rPr>
-          <w:t>https://github.com/SEG3125-2026/SEG3125-lab8-group05</w:t>
+          <w:t>https://github.com/SEG3125-2026/SEG3125-lab9-group05</w:t>
         </w:r>
       </w:hyperlink>
       <w:r>
-        <w:rPr>
-          <w:b/>
-          <w:bCs/>
-        </w:rPr>
         <w:t xml:space="preserve"> </w:t>
       </w:r>
     </w:p>

</xml_diff>